<commit_message>
UPDATED FULL SUBMISSION TEPLATE
</commit_message>
<xml_diff>
--- a/Final Report Submission Template.docx
+++ b/Final Report Submission Template.docx
@@ -221,15 +221,15 @@
       <w:tblPr/>
       <w:tblGrid>
         <w:gridCol w:w="1408"/>
-        <w:gridCol w:w="2693"/>
-        <w:gridCol w:w="2410"/>
-        <w:gridCol w:w="1522"/>
-        <w:gridCol w:w="3390"/>
+        <w:gridCol w:w="1343"/>
+        <w:gridCol w:w="1420"/>
+        <w:gridCol w:w="862"/>
+        <w:gridCol w:w="6390"/>
         <w:gridCol w:w="2459"/>
       </w:tblGrid>
       <w:tr>
         <w:trPr>
-          <w:trHeight w:val="456" w:hRule="auto"/>
+          <w:trHeight w:val="540" w:hRule="auto"/>
           <w:jc w:val="left"/>
         </w:trPr>
         <w:tc>
@@ -275,7 +275,7 @@
         </w:tc>
         <w:tc>
           <w:tcPr>
-            <w:tcW w:w="2693" w:type="dxa"/>
+            <w:tcW w:w="1343" w:type="dxa"/>
             <w:tcBorders>
               <w:top w:val="single" w:color="747474" w:sz="8"/>
               <w:left w:val="single" w:color="747474" w:sz="8"/>
@@ -316,7 +316,7 @@
         </w:tc>
         <w:tc>
           <w:tcPr>
-            <w:tcW w:w="2410" w:type="dxa"/>
+            <w:tcW w:w="1420" w:type="dxa"/>
             <w:tcBorders>
               <w:top w:val="single" w:color="747474" w:sz="8"/>
               <w:left w:val="single" w:color="747474" w:sz="8"/>
@@ -357,7 +357,7 @@
         </w:tc>
         <w:tc>
           <w:tcPr>
-            <w:tcW w:w="1522" w:type="dxa"/>
+            <w:tcW w:w="862" w:type="dxa"/>
             <w:tcBorders>
               <w:top w:val="single" w:color="747474" w:sz="8"/>
               <w:left w:val="single" w:color="747474" w:sz="8"/>
@@ -398,7 +398,7 @@
         </w:tc>
         <w:tc>
           <w:tcPr>
-            <w:tcW w:w="3390" w:type="dxa"/>
+            <w:tcW w:w="6390" w:type="dxa"/>
             <w:tcBorders>
               <w:top w:val="single" w:color="747474" w:sz="8"/>
               <w:left w:val="single" w:color="747474" w:sz="8"/>
@@ -527,7 +527,7 @@
         </w:tc>
         <w:tc>
           <w:tcPr>
-            <w:tcW w:w="2693" w:type="dxa"/>
+            <w:tcW w:w="1343" w:type="dxa"/>
             <w:tcBorders>
               <w:top w:val="single" w:color="747474" w:sz="8"/>
               <w:left w:val="single" w:color="747474" w:sz="8"/>
@@ -559,7 +559,7 @@
         </w:tc>
         <w:tc>
           <w:tcPr>
-            <w:tcW w:w="2410" w:type="dxa"/>
+            <w:tcW w:w="1420" w:type="dxa"/>
             <w:tcBorders>
               <w:top w:val="single" w:color="747474" w:sz="8"/>
               <w:left w:val="single" w:color="747474" w:sz="8"/>
@@ -591,7 +591,7 @@
         </w:tc>
         <w:tc>
           <w:tcPr>
-            <w:tcW w:w="1522" w:type="dxa"/>
+            <w:tcW w:w="862" w:type="dxa"/>
             <w:tcBorders>
               <w:top w:val="single" w:color="747474" w:sz="8"/>
               <w:left w:val="single" w:color="747474" w:sz="8"/>
@@ -623,7 +623,7 @@
         </w:tc>
         <w:tc>
           <w:tcPr>
-            <w:tcW w:w="3390" w:type="dxa"/>
+            <w:tcW w:w="6390" w:type="dxa"/>
             <w:tcBorders>
               <w:top w:val="single" w:color="747474" w:sz="8"/>
               <w:left w:val="single" w:color="747474" w:sz="8"/>
@@ -734,7 +734,7 @@
         </w:tc>
         <w:tc>
           <w:tcPr>
-            <w:tcW w:w="2693" w:type="dxa"/>
+            <w:tcW w:w="1343" w:type="dxa"/>
             <w:tcBorders>
               <w:top w:val="single" w:color="747474" w:sz="8"/>
               <w:left w:val="single" w:color="747474" w:sz="8"/>
@@ -766,71 +766,93 @@
         </w:tc>
         <w:tc>
           <w:tcPr>
-            <w:tcW w:w="2410" w:type="dxa"/>
-            <w:tcBorders>
-              <w:top w:val="single" w:color="747474" w:sz="8"/>
-              <w:left w:val="single" w:color="747474" w:sz="8"/>
-              <w:bottom w:val="single" w:color="747474" w:sz="8"/>
-              <w:right w:val="single" w:color="747474" w:sz="8"/>
-            </w:tcBorders>
-            <w:shd w:color="auto" w:fill="0398fb" w:val="clear"/>
-            <w:tcMar>
-              <w:left w:w="42" w:type="dxa"/>
-              <w:right w:w="42" w:type="dxa"/>
-            </w:tcMar>
-            <w:vAlign w:val="center"/>
-          </w:tcPr>
-          <w:p>
-            <w:pPr>
-              <w:spacing w:before="0" w:after="0" w:line="240"/>
-              <w:ind w:right="0" w:left="0" w:firstLine="0"/>
-              <w:jc w:val="left"/>
-              <w:rPr>
-                <w:rFonts w:ascii="Calibri" w:hAnsi="Calibri" w:cs="Calibri" w:eastAsia="Calibri"/>
-                <w:color w:val="auto"/>
-                <w:spacing w:val="0"/>
-                <w:position w:val="0"/>
-                <w:sz w:val="22"/>
-                <w:shd w:fill="auto" w:val="clear"/>
-              </w:rPr>
-            </w:pPr>
-          </w:p>
-        </w:tc>
-        <w:tc>
-          <w:tcPr>
-            <w:tcW w:w="1522" w:type="dxa"/>
-            <w:tcBorders>
-              <w:top w:val="single" w:color="747474" w:sz="8"/>
-              <w:left w:val="single" w:color="747474" w:sz="8"/>
-              <w:bottom w:val="single" w:color="747474" w:sz="8"/>
-              <w:right w:val="single" w:color="747474" w:sz="8"/>
-            </w:tcBorders>
-            <w:shd w:color="auto" w:fill="0398fb" w:val="clear"/>
-            <w:tcMar>
-              <w:left w:w="42" w:type="dxa"/>
-              <w:right w:w="42" w:type="dxa"/>
-            </w:tcMar>
-            <w:vAlign w:val="center"/>
-          </w:tcPr>
-          <w:p>
-            <w:pPr>
-              <w:spacing w:before="0" w:after="0" w:line="240"/>
-              <w:ind w:right="0" w:left="0" w:firstLine="0"/>
-              <w:jc w:val="left"/>
-              <w:rPr>
-                <w:rFonts w:ascii="Calibri" w:hAnsi="Calibri" w:cs="Calibri" w:eastAsia="Calibri"/>
-                <w:color w:val="auto"/>
-                <w:spacing w:val="0"/>
-                <w:position w:val="0"/>
-                <w:sz w:val="22"/>
-                <w:shd w:fill="auto" w:val="clear"/>
-              </w:rPr>
-            </w:pPr>
-          </w:p>
-        </w:tc>
-        <w:tc>
-          <w:tcPr>
-            <w:tcW w:w="3390" w:type="dxa"/>
+            <w:tcW w:w="1420" w:type="dxa"/>
+            <w:tcBorders>
+              <w:top w:val="single" w:color="747474" w:sz="8"/>
+              <w:left w:val="single" w:color="747474" w:sz="8"/>
+              <w:bottom w:val="single" w:color="747474" w:sz="8"/>
+              <w:right w:val="single" w:color="747474" w:sz="8"/>
+            </w:tcBorders>
+            <w:shd w:color="auto" w:fill="0398fb" w:val="clear"/>
+            <w:tcMar>
+              <w:left w:w="42" w:type="dxa"/>
+              <w:right w:w="42" w:type="dxa"/>
+            </w:tcMar>
+            <w:vAlign w:val="center"/>
+          </w:tcPr>
+          <w:p>
+            <w:pPr>
+              <w:spacing w:before="0" w:after="0" w:line="240"/>
+              <w:ind w:right="0" w:left="0" w:firstLine="0"/>
+              <w:jc w:val="center"/>
+              <w:rPr>
+                <w:rFonts w:ascii="Calibri" w:hAnsi="Calibri" w:cs="Calibri" w:eastAsia="Calibri"/>
+                <w:color w:val="auto"/>
+                <w:spacing w:val="0"/>
+                <w:position w:val="0"/>
+                <w:sz w:val="22"/>
+                <w:shd w:fill="auto" w:val="clear"/>
+              </w:rPr>
+            </w:pPr>
+            <w:r>
+              <w:rPr>
+                <w:rFonts w:ascii="Calibri" w:hAnsi="Calibri" w:cs="Calibri" w:eastAsia="Calibri"/>
+                <w:color w:val="auto"/>
+                <w:spacing w:val="0"/>
+                <w:position w:val="0"/>
+                <w:sz w:val="22"/>
+                <w:shd w:fill="auto" w:val="clear"/>
+              </w:rPr>
+              <w:t xml:space="preserve">INFORMATION SAVES PERSISTENTLY</w:t>
+            </w:r>
+          </w:p>
+        </w:tc>
+        <w:tc>
+          <w:tcPr>
+            <w:tcW w:w="862" w:type="dxa"/>
+            <w:tcBorders>
+              <w:top w:val="single" w:color="747474" w:sz="8"/>
+              <w:left w:val="single" w:color="747474" w:sz="8"/>
+              <w:bottom w:val="single" w:color="747474" w:sz="8"/>
+              <w:right w:val="single" w:color="747474" w:sz="8"/>
+            </w:tcBorders>
+            <w:shd w:color="auto" w:fill="0398fb" w:val="clear"/>
+            <w:tcMar>
+              <w:left w:w="42" w:type="dxa"/>
+              <w:right w:w="42" w:type="dxa"/>
+            </w:tcMar>
+            <w:vAlign w:val="center"/>
+          </w:tcPr>
+          <w:p>
+            <w:pPr>
+              <w:spacing w:before="0" w:after="0" w:line="240"/>
+              <w:ind w:right="0" w:left="0" w:firstLine="0"/>
+              <w:jc w:val="center"/>
+              <w:rPr>
+                <w:rFonts w:ascii="Calibri" w:hAnsi="Calibri" w:cs="Calibri" w:eastAsia="Calibri"/>
+                <w:color w:val="auto"/>
+                <w:spacing w:val="0"/>
+                <w:position w:val="0"/>
+                <w:sz w:val="22"/>
+                <w:shd w:fill="auto" w:val="clear"/>
+              </w:rPr>
+            </w:pPr>
+            <w:r>
+              <w:rPr>
+                <w:rFonts w:ascii="Calibri" w:hAnsi="Calibri" w:cs="Calibri" w:eastAsia="Calibri"/>
+                <w:color w:val="auto"/>
+                <w:spacing w:val="0"/>
+                <w:position w:val="0"/>
+                <w:sz w:val="22"/>
+                <w:shd w:fill="auto" w:val="clear"/>
+              </w:rPr>
+              <w:t xml:space="preserve">BASIC GITHUB USAGE</w:t>
+            </w:r>
+          </w:p>
+        </w:tc>
+        <w:tc>
+          <w:tcPr>
+            <w:tcW w:w="6390" w:type="dxa"/>
             <w:tcBorders>
               <w:top w:val="single" w:color="747474" w:sz="8"/>
               <w:left w:val="single" w:color="747474" w:sz="8"/>
@@ -941,7 +963,50 @@
         </w:tc>
         <w:tc>
           <w:tcPr>
-            <w:tcW w:w="2693" w:type="dxa"/>
+            <w:tcW w:w="1343" w:type="dxa"/>
+            <w:tcBorders>
+              <w:top w:val="single" w:color="747474" w:sz="8"/>
+              <w:left w:val="single" w:color="747474" w:sz="8"/>
+              <w:bottom w:val="single" w:color="747474" w:sz="8"/>
+              <w:right w:val="single" w:color="747474" w:sz="8"/>
+            </w:tcBorders>
+            <w:shd w:color="auto" w:fill="0398fb" w:val="clear"/>
+            <w:tcMar>
+              <w:left w:w="42" w:type="dxa"/>
+              <w:right w:w="42" w:type="dxa"/>
+            </w:tcMar>
+            <w:vAlign w:val="center"/>
+          </w:tcPr>
+          <w:p>
+            <w:pPr>
+              <w:spacing w:before="0" w:after="0" w:line="240"/>
+              <w:ind w:right="0" w:left="0" w:firstLine="0"/>
+              <w:jc w:val="center"/>
+              <w:rPr>
+                <w:rFonts w:ascii="Calibri" w:hAnsi="Calibri" w:cs="Calibri" w:eastAsia="Calibri"/>
+                <w:color w:val="auto"/>
+                <w:spacing w:val="0"/>
+                <w:position w:val="0"/>
+                <w:sz w:val="22"/>
+                <w:shd w:fill="auto" w:val="clear"/>
+              </w:rPr>
+            </w:pPr>
+            <w:r>
+              <w:rPr>
+                <w:rFonts w:ascii="Calibri" w:hAnsi="Calibri" w:cs="Calibri" w:eastAsia="Calibri"/>
+                <w:color w:val="auto"/>
+                <w:spacing w:val="0"/>
+                <w:position w:val="0"/>
+                <w:sz w:val="22"/>
+                <w:shd w:fill="auto" w:val="clear"/>
+              </w:rPr>
+              <w:t xml:space="preserve">FULL CRUD IMPLEMENTATION</w:t>
+            </w:r>
+          </w:p>
+        </w:tc>
+        <w:tc>
+          <w:tcPr>
+            <w:tcW w:w="1420" w:type="dxa"/>
             <w:tcBorders>
               <w:top w:val="single" w:color="747474" w:sz="8"/>
               <w:left w:val="single" w:color="747474" w:sz="8"/>
@@ -973,7 +1038,7 @@
         </w:tc>
         <w:tc>
           <w:tcPr>
-            <w:tcW w:w="2410" w:type="dxa"/>
+            <w:tcW w:w="862" w:type="dxa"/>
             <w:tcBorders>
               <w:top w:val="single" w:color="747474" w:sz="8"/>
               <w:left w:val="single" w:color="747474" w:sz="8"/>
@@ -1005,66 +1070,45 @@
         </w:tc>
         <w:tc>
           <w:tcPr>
-            <w:tcW w:w="1522" w:type="dxa"/>
-            <w:tcBorders>
-              <w:top w:val="single" w:color="747474" w:sz="8"/>
-              <w:left w:val="single" w:color="747474" w:sz="8"/>
-              <w:bottom w:val="single" w:color="747474" w:sz="8"/>
-              <w:right w:val="single" w:color="747474" w:sz="8"/>
-            </w:tcBorders>
-            <w:shd w:color="auto" w:fill="0398fb" w:val="clear"/>
-            <w:tcMar>
-              <w:left w:w="42" w:type="dxa"/>
-              <w:right w:w="42" w:type="dxa"/>
-            </w:tcMar>
-            <w:vAlign w:val="center"/>
-          </w:tcPr>
-          <w:p>
-            <w:pPr>
-              <w:spacing w:before="0" w:after="0" w:line="240"/>
-              <w:ind w:right="0" w:left="0" w:firstLine="0"/>
-              <w:jc w:val="left"/>
-              <w:rPr>
-                <w:rFonts w:ascii="Calibri" w:hAnsi="Calibri" w:cs="Calibri" w:eastAsia="Calibri"/>
-                <w:color w:val="auto"/>
-                <w:spacing w:val="0"/>
-                <w:position w:val="0"/>
-                <w:sz w:val="22"/>
-                <w:shd w:fill="auto" w:val="clear"/>
-              </w:rPr>
-            </w:pPr>
-          </w:p>
-        </w:tc>
-        <w:tc>
-          <w:tcPr>
-            <w:tcW w:w="3390" w:type="dxa"/>
-            <w:tcBorders>
-              <w:top w:val="single" w:color="747474" w:sz="8"/>
-              <w:left w:val="single" w:color="747474" w:sz="8"/>
-              <w:bottom w:val="single" w:color="747474" w:sz="8"/>
-              <w:right w:val="single" w:color="747474" w:sz="8"/>
-            </w:tcBorders>
-            <w:shd w:color="auto" w:fill="0398fb" w:val="clear"/>
-            <w:tcMar>
-              <w:left w:w="42" w:type="dxa"/>
-              <w:right w:w="42" w:type="dxa"/>
-            </w:tcMar>
-            <w:vAlign w:val="center"/>
-          </w:tcPr>
-          <w:p>
-            <w:pPr>
-              <w:spacing w:before="0" w:after="0" w:line="240"/>
-              <w:ind w:right="0" w:left="0" w:firstLine="0"/>
-              <w:jc w:val="left"/>
-              <w:rPr>
-                <w:rFonts w:ascii="Calibri" w:hAnsi="Calibri" w:cs="Calibri" w:eastAsia="Calibri"/>
-                <w:color w:val="auto"/>
-                <w:spacing w:val="0"/>
-                <w:position w:val="0"/>
-                <w:sz w:val="22"/>
-                <w:shd w:fill="auto" w:val="clear"/>
-              </w:rPr>
-            </w:pPr>
+            <w:tcW w:w="6390" w:type="dxa"/>
+            <w:tcBorders>
+              <w:top w:val="single" w:color="747474" w:sz="8"/>
+              <w:left w:val="single" w:color="747474" w:sz="8"/>
+              <w:bottom w:val="single" w:color="747474" w:sz="8"/>
+              <w:right w:val="single" w:color="747474" w:sz="8"/>
+            </w:tcBorders>
+            <w:shd w:color="auto" w:fill="0398fb" w:val="clear"/>
+            <w:tcMar>
+              <w:left w:w="42" w:type="dxa"/>
+              <w:right w:w="42" w:type="dxa"/>
+            </w:tcMar>
+            <w:vAlign w:val="center"/>
+          </w:tcPr>
+          <w:p>
+            <w:pPr>
+              <w:spacing w:before="0" w:after="0" w:line="240"/>
+              <w:ind w:right="0" w:left="0" w:firstLine="0"/>
+              <w:jc w:val="center"/>
+              <w:rPr>
+                <w:rFonts w:ascii="Calibri" w:hAnsi="Calibri" w:cs="Calibri" w:eastAsia="Calibri"/>
+                <w:color w:val="auto"/>
+                <w:spacing w:val="0"/>
+                <w:position w:val="0"/>
+                <w:sz w:val="22"/>
+                <w:shd w:fill="auto" w:val="clear"/>
+              </w:rPr>
+            </w:pPr>
+            <w:r>
+              <w:rPr>
+                <w:rFonts w:ascii="Calibri" w:hAnsi="Calibri" w:cs="Calibri" w:eastAsia="Calibri"/>
+                <w:color w:val="auto"/>
+                <w:spacing w:val="0"/>
+                <w:position w:val="0"/>
+                <w:sz w:val="22"/>
+                <w:shd w:fill="auto" w:val="clear"/>
+              </w:rPr>
+              <w:t xml:space="preserve">USE/ATTEPTED USE OF MORE COMPLEX UI LAYOUT</w:t>
+            </w:r>
           </w:p>
         </w:tc>
         <w:tc>
@@ -1148,7 +1192,7 @@
         </w:tc>
         <w:tc>
           <w:tcPr>
-            <w:tcW w:w="2693" w:type="dxa"/>
+            <w:tcW w:w="1343" w:type="dxa"/>
             <w:tcBorders>
               <w:top w:val="single" w:color="747474" w:sz="8"/>
               <w:left w:val="single" w:color="747474" w:sz="8"/>
@@ -1180,7 +1224,7 @@
         </w:tc>
         <w:tc>
           <w:tcPr>
-            <w:tcW w:w="2410" w:type="dxa"/>
+            <w:tcW w:w="1420" w:type="dxa"/>
             <w:tcBorders>
               <w:top w:val="single" w:color="747474" w:sz="8"/>
               <w:left w:val="single" w:color="747474" w:sz="8"/>
@@ -1212,7 +1256,7 @@
         </w:tc>
         <w:tc>
           <w:tcPr>
-            <w:tcW w:w="1522" w:type="dxa"/>
+            <w:tcW w:w="862" w:type="dxa"/>
             <w:tcBorders>
               <w:top w:val="single" w:color="747474" w:sz="8"/>
               <w:left w:val="single" w:color="747474" w:sz="8"/>
@@ -1244,7 +1288,7 @@
         </w:tc>
         <w:tc>
           <w:tcPr>
-            <w:tcW w:w="3390" w:type="dxa"/>
+            <w:tcW w:w="6390" w:type="dxa"/>
             <w:tcBorders>
               <w:top w:val="single" w:color="747474" w:sz="8"/>
               <w:left w:val="single" w:color="747474" w:sz="8"/>
@@ -1378,6 +1422,69 @@
           <w:shd w:fill="auto" w:val="clear"/>
         </w:rPr>
       </w:pPr>
+      <w:r>
+        <w:rPr>
+          <w:rFonts w:ascii="Calibri" w:hAnsi="Calibri" w:cs="Calibri" w:eastAsia="Calibri"/>
+          <w:color w:val="auto"/>
+          <w:spacing w:val="0"/>
+          <w:position w:val="0"/>
+          <w:sz w:val="24"/>
+          <w:shd w:fill="auto" w:val="clear"/>
+        </w:rPr>
+        <w:t xml:space="preserve">- GITHUB: Github usage had to be learned as I had never used it before to any real extent further than downloading</w:t>
+      </w:r>
+    </w:p>
+    <w:p>
+      <w:pPr>
+        <w:spacing w:before="0" w:after="0" w:line="240"/>
+        <w:ind w:right="0" w:left="0" w:firstLine="0"/>
+        <w:jc w:val="left"/>
+        <w:rPr>
+          <w:rFonts w:ascii="Calibri" w:hAnsi="Calibri" w:cs="Calibri" w:eastAsia="Calibri"/>
+          <w:color w:val="auto"/>
+          <w:spacing w:val="0"/>
+          <w:position w:val="0"/>
+          <w:sz w:val="24"/>
+          <w:shd w:fill="auto" w:val="clear"/>
+        </w:rPr>
+      </w:pPr>
+      <w:r>
+        <w:rPr>
+          <w:rFonts w:ascii="Calibri" w:hAnsi="Calibri" w:cs="Calibri" w:eastAsia="Calibri"/>
+          <w:color w:val="auto"/>
+          <w:spacing w:val="0"/>
+          <w:position w:val="0"/>
+          <w:sz w:val="24"/>
+          <w:shd w:fill="auto" w:val="clear"/>
+        </w:rPr>
+        <w:t xml:space="preserve">- MAP: Map usage ended up having to be done manually with coordinates, not sure if it was an emulator issue or an issue with the code actually not working.</w:t>
+      </w:r>
+    </w:p>
+    <w:p>
+      <w:pPr>
+        <w:spacing w:before="0" w:after="0" w:line="240"/>
+        <w:ind w:right="0" w:left="0" w:firstLine="0"/>
+        <w:jc w:val="left"/>
+        <w:rPr>
+          <w:rFonts w:ascii="Calibri" w:hAnsi="Calibri" w:cs="Calibri" w:eastAsia="Calibri"/>
+          <w:color w:val="auto"/>
+          <w:spacing w:val="0"/>
+          <w:position w:val="0"/>
+          <w:sz w:val="24"/>
+          <w:shd w:fill="auto" w:val="clear"/>
+        </w:rPr>
+      </w:pPr>
+      <w:r>
+        <w:rPr>
+          <w:rFonts w:ascii="Calibri" w:hAnsi="Calibri" w:cs="Calibri" w:eastAsia="Calibri"/>
+          <w:color w:val="auto"/>
+          <w:spacing w:val="0"/>
+          <w:position w:val="0"/>
+          <w:sz w:val="24"/>
+          <w:shd w:fill="auto" w:val="clear"/>
+        </w:rPr>
+        <w:t xml:space="preserve">- INITIAL SETUP: Had to reset the project once or twice due to messy and non-working code.</w:t>
+      </w:r>
     </w:p>
     <w:p>
       <w:pPr>

</xml_diff>